<commit_message>
Update report with all 5 seeds for MLP Late Fusion (no more 1-seed warnings)
</commit_message>
<xml_diff>
--- a/experiments/report_multi_seed/resnet3d_fusion_report.docx
+++ b/experiments/report_multi_seed/resnet3d_fusion_report.docx
@@ -195,7 +195,7 @@
               <w:rPr>
                 <w:sz w:val="18"/>
               </w:rPr>
-              <w:t>90.9 +/- 1.5</w:t>
+              <w:t>91.2 +/- 1.5</w:t>
             </w:r>
           </w:p>
         </w:tc>
@@ -211,7 +211,7 @@
               <w:rPr>
                 <w:sz w:val="18"/>
               </w:rPr>
-              <w:t>89.1 +/- 0.5</w:t>
+              <w:t>89.2 +/- 0.5</w:t>
             </w:r>
           </w:p>
         </w:tc>
@@ -227,7 +227,7 @@
               <w:rPr>
                 <w:sz w:val="18"/>
               </w:rPr>
-              <w:t>86.0 +/- 1.6</w:t>
+              <w:t>85.8 +/- 1.4</w:t>
             </w:r>
           </w:p>
         </w:tc>
@@ -243,7 +243,7 @@
               <w:rPr>
                 <w:sz w:val="18"/>
               </w:rPr>
-              <w:t>92.2 +/- 2.3</w:t>
+              <w:t>92.7 +/- 2.2</w:t>
             </w:r>
           </w:p>
         </w:tc>
@@ -275,7 +275,7 @@
               <w:rPr>
                 <w:sz w:val="18"/>
               </w:rPr>
-              <w:t>4</w:t>
+              <w:t>5</w:t>
             </w:r>
           </w:p>
         </w:tc>
@@ -521,6 +521,120 @@
               <w:rPr>
                 <w:sz w:val="18"/>
               </w:rPr>
+              <w:t>MLP Late Avg</w:t>
+            </w:r>
+          </w:p>
+        </w:tc>
+        <w:tc>
+          <w:tcPr>
+            <w:tcW w:type="dxa" w:w="1234"/>
+          </w:tcPr>
+          <w:p>
+            <w:pPr>
+              <w:jc w:val="center"/>
+            </w:pPr>
+            <w:r>
+              <w:rPr>
+                <w:sz w:val="18"/>
+              </w:rPr>
+              <w:t>89.8 +/- 1.3</w:t>
+            </w:r>
+          </w:p>
+        </w:tc>
+        <w:tc>
+          <w:tcPr>
+            <w:tcW w:type="dxa" w:w="1234"/>
+          </w:tcPr>
+          <w:p>
+            <w:pPr>
+              <w:jc w:val="center"/>
+            </w:pPr>
+            <w:r>
+              <w:rPr>
+                <w:sz w:val="18"/>
+              </w:rPr>
+              <w:t>86.0 +/- 1.4</w:t>
+            </w:r>
+          </w:p>
+        </w:tc>
+        <w:tc>
+          <w:tcPr>
+            <w:tcW w:type="dxa" w:w="1234"/>
+          </w:tcPr>
+          <w:p>
+            <w:pPr>
+              <w:jc w:val="center"/>
+            </w:pPr>
+            <w:r>
+              <w:rPr>
+                <w:sz w:val="18"/>
+              </w:rPr>
+              <w:t>79.3 +/- 4.4</w:t>
+            </w:r>
+          </w:p>
+        </w:tc>
+        <w:tc>
+          <w:tcPr>
+            <w:tcW w:type="dxa" w:w="1234"/>
+          </w:tcPr>
+          <w:p>
+            <w:pPr>
+              <w:jc w:val="center"/>
+            </w:pPr>
+            <w:r>
+              <w:rPr>
+                <w:sz w:val="18"/>
+              </w:rPr>
+              <w:t>92.8 +/- 2.6</w:t>
+            </w:r>
+          </w:p>
+        </w:tc>
+        <w:tc>
+          <w:tcPr>
+            <w:tcW w:type="dxa" w:w="1234"/>
+          </w:tcPr>
+          <w:p>
+            <w:pPr>
+              <w:jc w:val="center"/>
+            </w:pPr>
+            <w:r>
+              <w:rPr>
+                <w:sz w:val="18"/>
+              </w:rPr>
+              <w:t>0.947 +/- 0.004</w:t>
+            </w:r>
+          </w:p>
+        </w:tc>
+        <w:tc>
+          <w:tcPr>
+            <w:tcW w:type="dxa" w:w="1234"/>
+          </w:tcPr>
+          <w:p>
+            <w:pPr>
+              <w:jc w:val="center"/>
+            </w:pPr>
+            <w:r>
+              <w:rPr>
+                <w:sz w:val="18"/>
+              </w:rPr>
+              <w:t>5</w:t>
+            </w:r>
+          </w:p>
+        </w:tc>
+      </w:tr>
+      <w:tr>
+        <w:tc>
+          <w:tcPr>
+            <w:tcW w:type="dxa" w:w="1234"/>
+          </w:tcPr>
+          <w:p>
+            <w:pPr>
+              <w:jc w:val="center"/>
+            </w:pPr>
+            <w:r>
+              <w:rPr>
+                <w:sz w:val="18"/>
+              </w:rPr>
               <w:t>XGB Late Avg</w:t>
             </w:r>
           </w:p>
@@ -618,120 +732,6 @@
                 <w:sz w:val="18"/>
               </w:rPr>
               <w:t>5</w:t>
-            </w:r>
-          </w:p>
-        </w:tc>
-      </w:tr>
-      <w:tr>
-        <w:tc>
-          <w:tcPr>
-            <w:tcW w:type="dxa" w:w="1234"/>
-          </w:tcPr>
-          <w:p>
-            <w:pPr>
-              <w:jc w:val="center"/>
-            </w:pPr>
-            <w:r>
-              <w:rPr>
-                <w:sz w:val="18"/>
-              </w:rPr>
-              <w:t>MLP Late Avg</w:t>
-            </w:r>
-          </w:p>
-        </w:tc>
-        <w:tc>
-          <w:tcPr>
-            <w:tcW w:type="dxa" w:w="1234"/>
-          </w:tcPr>
-          <w:p>
-            <w:pPr>
-              <w:jc w:val="center"/>
-            </w:pPr>
-            <w:r>
-              <w:rPr>
-                <w:sz w:val="18"/>
-              </w:rPr>
-              <w:t>89.6 +/- 1.5</w:t>
-            </w:r>
-          </w:p>
-        </w:tc>
-        <w:tc>
-          <w:tcPr>
-            <w:tcW w:type="dxa" w:w="1234"/>
-          </w:tcPr>
-          <w:p>
-            <w:pPr>
-              <w:jc w:val="center"/>
-            </w:pPr>
-            <w:r>
-              <w:rPr>
-                <w:sz w:val="18"/>
-              </w:rPr>
-              <w:t>86.2 +/- 1.5</w:t>
-            </w:r>
-          </w:p>
-        </w:tc>
-        <w:tc>
-          <w:tcPr>
-            <w:tcW w:type="dxa" w:w="1234"/>
-          </w:tcPr>
-          <w:p>
-            <w:pPr>
-              <w:jc w:val="center"/>
-            </w:pPr>
-            <w:r>
-              <w:rPr>
-                <w:sz w:val="18"/>
-              </w:rPr>
-              <w:t>80.1 +/- 4.7</w:t>
-            </w:r>
-          </w:p>
-        </w:tc>
-        <w:tc>
-          <w:tcPr>
-            <w:tcW w:type="dxa" w:w="1234"/>
-          </w:tcPr>
-          <w:p>
-            <w:pPr>
-              <w:jc w:val="center"/>
-            </w:pPr>
-            <w:r>
-              <w:rPr>
-                <w:sz w:val="18"/>
-              </w:rPr>
-              <w:t>92.3 +/- 2.7</w:t>
-            </w:r>
-          </w:p>
-        </w:tc>
-        <w:tc>
-          <w:tcPr>
-            <w:tcW w:type="dxa" w:w="1234"/>
-          </w:tcPr>
-          <w:p>
-            <w:pPr>
-              <w:jc w:val="center"/>
-            </w:pPr>
-            <w:r>
-              <w:rPr>
-                <w:sz w:val="18"/>
-              </w:rPr>
-              <w:t>0.946 +/- 0.005</w:t>
-            </w:r>
-          </w:p>
-        </w:tc>
-        <w:tc>
-          <w:tcPr>
-            <w:tcW w:type="dxa" w:w="1234"/>
-          </w:tcPr>
-          <w:p>
-            <w:pPr>
-              <w:jc w:val="center"/>
-            </w:pPr>
-            <w:r>
-              <w:rPr>
-                <w:sz w:val="18"/>
-              </w:rPr>
-              <w:t>4</w:t>
             </w:r>
           </w:p>
         </w:tc>
@@ -993,7 +993,7 @@
               <w:rPr>
                 <w:sz w:val="18"/>
               </w:rPr>
-              <w:t>84.7 +/- 1.2</w:t>
+              <w:t>85.0 +/- 1.3</w:t>
             </w:r>
           </w:p>
         </w:tc>
@@ -1009,7 +1009,7 @@
               <w:rPr>
                 <w:sz w:val="18"/>
               </w:rPr>
-              <w:t>85.7 +/- 0.7</w:t>
+              <w:t>85.8 +/- 0.6</w:t>
             </w:r>
           </w:p>
         </w:tc>
@@ -1025,7 +1025,7 @@
               <w:rPr>
                 <w:sz w:val="18"/>
               </w:rPr>
-              <w:t>87.5 +/- 1.3</w:t>
+              <w:t>87.3 +/- 1.3</w:t>
             </w:r>
           </w:p>
         </w:tc>
@@ -1041,7 +1041,7 @@
               <w:rPr>
                 <w:sz w:val="18"/>
               </w:rPr>
-              <w:t>83.9 +/- 1.8</w:t>
+              <w:t>84.4 +/- 1.9</w:t>
             </w:r>
           </w:p>
         </w:tc>
@@ -1073,7 +1073,7 @@
               <w:rPr>
                 <w:sz w:val="18"/>
               </w:rPr>
-              <w:t>4</w:t>
+              <w:t>5</w:t>
             </w:r>
           </w:p>
         </w:tc>
@@ -1221,7 +1221,7 @@
               <w:rPr>
                 <w:sz w:val="18"/>
               </w:rPr>
-              <w:t>88.2 +/- 1.1</w:t>
+              <w:t>88.4 +/- 1.1</w:t>
             </w:r>
           </w:p>
         </w:tc>
@@ -1237,7 +1237,7 @@
               <w:rPr>
                 <w:sz w:val="18"/>
               </w:rPr>
-              <w:t>81.7 +/- 1.3</w:t>
+              <w:t>81.6 +/- 1.1</w:t>
             </w:r>
           </w:p>
         </w:tc>
@@ -1253,7 +1253,7 @@
               <w:rPr>
                 <w:sz w:val="18"/>
               </w:rPr>
-              <w:t>70.2 +/- 4.4</w:t>
+              <w:t>69.6 +/- 4.0</w:t>
             </w:r>
           </w:p>
         </w:tc>
@@ -1269,7 +1269,7 @@
               <w:rPr>
                 <w:sz w:val="18"/>
               </w:rPr>
-              <w:t>93.2 +/- 2.4</w:t>
+              <w:t>93.6 +/- 2.3</w:t>
             </w:r>
           </w:p>
         </w:tc>
@@ -1285,7 +1285,7 @@
               <w:rPr>
                 <w:sz w:val="18"/>
               </w:rPr>
-              <w:t>0.904 +/- 0.030</w:t>
+              <w:t>0.910 +/- 0.030</w:t>
             </w:r>
           </w:p>
         </w:tc>
@@ -1301,7 +1301,7 @@
               <w:rPr>
                 <w:sz w:val="18"/>
               </w:rPr>
-              <w:t>4</w:t>
+              <w:t>5</w:t>
             </w:r>
           </w:p>
         </w:tc>
@@ -1445,7 +1445,7 @@
       <w:r>
         <w:drawing>
           <wp:inline xmlns:a="http://schemas.openxmlformats.org/drawingml/2006/main" xmlns:pic="http://schemas.openxmlformats.org/drawingml/2006/picture">
-            <wp:extent cx="5029200" cy="4550550"/>
+            <wp:extent cx="5029200" cy="4617638"/>
             <wp:docPr id="1" name="Picture 1"/>
             <wp:cNvGraphicFramePr>
               <a:graphicFrameLocks noChangeAspect="1"/>
@@ -1466,7 +1466,7 @@
                   <pic:spPr>
                     <a:xfrm>
                       <a:off x="0" y="0"/>
-                      <a:ext cx="5029200" cy="4550550"/>
+                      <a:ext cx="5029200" cy="4617638"/>
                     </a:xfrm>
                     <a:prstGeom prst="rect"/>
                   </pic:spPr>

</xml_diff>

<commit_message>
Ajout matrices de confusion et note sur les AUC dans le rapport
</commit_message>
<xml_diff>
--- a/experiments/report_multi_seed/resnet3d_fusion_report.docx
+++ b/experiments/report_multi_seed/resnet3d_fusion_report.docx
@@ -1572,7 +1572,67 @@
         <w:rPr>
           <w:color w:val="1A1A2E"/>
         </w:rPr>
-        <w:t>4. Interprétabilité — Integrated Gradients</w:t>
+        <w:t>4. Matrices de confusion</w:t>
+      </w:r>
+    </w:p>
+    <w:p>
+      <w:r>
+        <w:t>Les matrices de confusion ci-dessous sont calculées à partir des probabilités moyennes sur les 5 seeds (seuil de décision = 0.5). Le jeu de test contient 712 patients CN et 198 patients AD.</w:t>
+      </w:r>
+    </w:p>
+    <w:p>
+      <w:pPr>
+        <w:jc w:val="center"/>
+      </w:pPr>
+      <w:r>
+        <w:drawing>
+          <wp:inline xmlns:a="http://schemas.openxmlformats.org/drawingml/2006/main" xmlns:pic="http://schemas.openxmlformats.org/drawingml/2006/picture">
+            <wp:extent cx="5486400" cy="2971200"/>
+            <wp:docPr id="3" name="Picture 3"/>
+            <wp:cNvGraphicFramePr>
+              <a:graphicFrameLocks noChangeAspect="1"/>
+            </wp:cNvGraphicFramePr>
+            <a:graphic>
+              <a:graphicData uri="http://schemas.openxmlformats.org/drawingml/2006/picture">
+                <pic:pic>
+                  <pic:nvPicPr>
+                    <pic:cNvPr id="0" name="confusion_matrices.png"/>
+                    <pic:cNvPicPr/>
+                  </pic:nvPicPr>
+                  <pic:blipFill>
+                    <a:blip r:embed="rId11"/>
+                    <a:stretch>
+                      <a:fillRect/>
+                    </a:stretch>
+                  </pic:blipFill>
+                  <pic:spPr>
+                    <a:xfrm>
+                      <a:off x="0" y="0"/>
+                      <a:ext cx="5486400" cy="2971200"/>
+                    </a:xfrm>
+                    <a:prstGeom prst="rect"/>
+                  </pic:spPr>
+                </pic:pic>
+              </a:graphicData>
+            </a:graphic>
+          </wp:inline>
+        </w:drawing>
+      </w:r>
+    </w:p>
+    <w:p>
+      <w:r>
+        <w:t>Note : les AUC affichées sur les matrices de confusion correspondent aux AUC calculées sur les probabilités moyennées (utilisées pour le test de DeLong). Elles diffèrent légèrement des AUC du tableau de performances (section 1), qui sont la moyenne des AUC individuelles par seed. Les deux métriques sont complémentaires : la moyenne par seed mesure la stabilité, tandis que l'AUC sur probabilités moyennées bénéficie de l'effet d'ensemble.</w:t>
+      </w:r>
+    </w:p>
+    <w:p>
+      <w:pPr>
+        <w:pStyle w:val="Heading1"/>
+      </w:pPr>
+      <w:r>
+        <w:rPr>
+          <w:color w:val="1A1A2E"/>
+        </w:rPr>
+        <w:t>5. Interprétabilité — Integrated Gradients</w:t>
       </w:r>
     </w:p>
     <w:p>
@@ -1588,7 +1648,7 @@
         <w:rPr>
           <w:color w:val="1A1A2E"/>
         </w:rPr>
-        <w:t>4.1 Exemple : Patient Alzheimer</w:t>
+        <w:t>5.1 Exemple : Patient Alzheimer</w:t>
       </w:r>
     </w:p>
     <w:p>
@@ -1604,7 +1664,7 @@
         <w:drawing>
           <wp:inline xmlns:a="http://schemas.openxmlformats.org/drawingml/2006/main" xmlns:pic="http://schemas.openxmlformats.org/drawingml/2006/picture">
             <wp:extent cx="5029200" cy="1678514"/>
-            <wp:docPr id="3" name="Picture 3"/>
+            <wp:docPr id="4" name="Picture 4"/>
             <wp:cNvGraphicFramePr>
               <a:graphicFrameLocks noChangeAspect="1"/>
             </wp:cNvGraphicFramePr>
@@ -1616,7 +1676,7 @@
                     <pic:cNvPicPr/>
                   </pic:nvPicPr>
                   <pic:blipFill>
-                    <a:blip r:embed="rId11"/>
+                    <a:blip r:embed="rId12"/>
                     <a:stretch>
                       <a:fillRect/>
                     </a:stretch>
@@ -1651,7 +1711,7 @@
         <w:rPr>
           <w:color w:val="1A1A2E"/>
         </w:rPr>
-        <w:t>4.2 Exemple : Patient cognitivement normal</w:t>
+        <w:t>5.2 Exemple : Patient cognitivement normal</w:t>
       </w:r>
     </w:p>
     <w:p>
@@ -1667,7 +1727,7 @@
         <w:drawing>
           <wp:inline xmlns:a="http://schemas.openxmlformats.org/drawingml/2006/main" xmlns:pic="http://schemas.openxmlformats.org/drawingml/2006/picture">
             <wp:extent cx="5029200" cy="1678514"/>
-            <wp:docPr id="4" name="Picture 4"/>
+            <wp:docPr id="5" name="Picture 5"/>
             <wp:cNvGraphicFramePr>
               <a:graphicFrameLocks noChangeAspect="1"/>
             </wp:cNvGraphicFramePr>
@@ -1679,7 +1739,7 @@
                     <pic:cNvPicPr/>
                   </pic:nvPicPr>
                   <pic:blipFill>
-                    <a:blip r:embed="rId12"/>
+                    <a:blip r:embed="rId13"/>
                     <a:stretch>
                       <a:fillRect/>
                     </a:stretch>
@@ -1714,7 +1774,7 @@
         <w:rPr>
           <w:color w:val="1A1A2E"/>
         </w:rPr>
-        <w:t>5. Contenu du dossier d'interprétabilité</w:t>
+        <w:t>6. Contenu du dossier d'interprétabilité</w:t>
       </w:r>
     </w:p>
     <w:p>

</xml_diff>

<commit_message>
Ajout double AUC dans le tableau et explication du calcul des matrices de confusion
</commit_message>
<xml_diff>
--- a/experiments/report_multi_seed/resnet3d_fusion_report.docx
+++ b/experiments/report_multi_seed/resnet3d_fusion_report.docx
@@ -37,18 +37,19 @@
         <w:tblLook w:firstColumn="1" w:firstRow="1" w:lastColumn="0" w:lastRow="0" w:noHBand="0" w:noVBand="1" w:val="04A0"/>
       </w:tblPr>
       <w:tblGrid>
-        <w:gridCol w:w="1234"/>
-        <w:gridCol w:w="1234"/>
-        <w:gridCol w:w="1234"/>
-        <w:gridCol w:w="1234"/>
-        <w:gridCol w:w="1234"/>
-        <w:gridCol w:w="1234"/>
-        <w:gridCol w:w="1234"/>
+        <w:gridCol w:w="1080"/>
+        <w:gridCol w:w="1080"/>
+        <w:gridCol w:w="1080"/>
+        <w:gridCol w:w="1080"/>
+        <w:gridCol w:w="1080"/>
+        <w:gridCol w:w="1080"/>
+        <w:gridCol w:w="1080"/>
+        <w:gridCol w:w="1080"/>
       </w:tblGrid>
       <w:tr>
         <w:tc>
           <w:tcPr>
-            <w:tcW w:type="dxa" w:w="1234"/>
+            <w:tcW w:type="dxa" w:w="1080"/>
           </w:tcPr>
           <w:p>
             <w:pPr>
@@ -57,7 +58,7 @@
             <w:r>
               <w:rPr>
                 <w:b/>
-                <w:sz w:val="18"/>
+                <w:sz w:val="16"/>
               </w:rPr>
               <w:t>Méthode</w:t>
             </w:r>
@@ -65,7 +66,7 @@
         </w:tc>
         <w:tc>
           <w:tcPr>
-            <w:tcW w:type="dxa" w:w="1234"/>
+            <w:tcW w:type="dxa" w:w="1080"/>
           </w:tcPr>
           <w:p>
             <w:pPr>
@@ -74,7 +75,7 @@
             <w:r>
               <w:rPr>
                 <w:b/>
-                <w:sz w:val="18"/>
+                <w:sz w:val="16"/>
               </w:rPr>
               <w:t>Acc %</w:t>
             </w:r>
@@ -82,7 +83,7 @@
         </w:tc>
         <w:tc>
           <w:tcPr>
-            <w:tcW w:type="dxa" w:w="1234"/>
+            <w:tcW w:type="dxa" w:w="1080"/>
           </w:tcPr>
           <w:p>
             <w:pPr>
@@ -91,7 +92,7 @@
             <w:r>
               <w:rPr>
                 <w:b/>
-                <w:sz w:val="18"/>
+                <w:sz w:val="16"/>
               </w:rPr>
               <w:t>Acc Éq %</w:t>
             </w:r>
@@ -99,7 +100,7 @@
         </w:tc>
         <w:tc>
           <w:tcPr>
-            <w:tcW w:type="dxa" w:w="1234"/>
+            <w:tcW w:type="dxa" w:w="1080"/>
           </w:tcPr>
           <w:p>
             <w:pPr>
@@ -108,7 +109,7 @@
             <w:r>
               <w:rPr>
                 <w:b/>
-                <w:sz w:val="18"/>
+                <w:sz w:val="16"/>
               </w:rPr>
               <w:t>Sens %</w:t>
             </w:r>
@@ -116,7 +117,7 @@
         </w:tc>
         <w:tc>
           <w:tcPr>
-            <w:tcW w:type="dxa" w:w="1234"/>
+            <w:tcW w:type="dxa" w:w="1080"/>
           </w:tcPr>
           <w:p>
             <w:pPr>
@@ -125,7 +126,7 @@
             <w:r>
               <w:rPr>
                 <w:b/>
-                <w:sz w:val="18"/>
+                <w:sz w:val="16"/>
               </w:rPr>
               <w:t>Spéc %</w:t>
             </w:r>
@@ -133,7 +134,7 @@
         </w:tc>
         <w:tc>
           <w:tcPr>
-            <w:tcW w:type="dxa" w:w="1234"/>
+            <w:tcW w:type="dxa" w:w="1080"/>
           </w:tcPr>
           <w:p>
             <w:pPr>
@@ -142,15 +143,17 @@
             <w:r>
               <w:rPr>
                 <w:b/>
-                <w:sz w:val="18"/>
+                <w:sz w:val="16"/>
               </w:rPr>
               <w:t>AUC</w:t>
+              <w:br/>
+              <w:t>(moy. seeds)</w:t>
             </w:r>
           </w:p>
         </w:tc>
         <w:tc>
           <w:tcPr>
-            <w:tcW w:type="dxa" w:w="1234"/>
+            <w:tcW w:type="dxa" w:w="1080"/>
           </w:tcPr>
           <w:p>
             <w:pPr>
@@ -159,7 +162,26 @@
             <w:r>
               <w:rPr>
                 <w:b/>
-                <w:sz w:val="18"/>
+                <w:sz w:val="16"/>
+              </w:rPr>
+              <w:t>AUC</w:t>
+              <w:br/>
+              <w:t>(ensemble)</w:t>
+            </w:r>
+          </w:p>
+        </w:tc>
+        <w:tc>
+          <w:tcPr>
+            <w:tcW w:type="dxa" w:w="1080"/>
+          </w:tcPr>
+          <w:p>
+            <w:pPr>
+              <w:jc w:val="center"/>
+            </w:pPr>
+            <w:r>
+              <w:rPr>
+                <w:b/>
+                <w:sz w:val="16"/>
               </w:rPr>
               <w:t>Seeds</w:t>
             </w:r>
@@ -169,7 +191,7 @@
       <w:tr>
         <w:tc>
           <w:tcPr>
-            <w:tcW w:type="dxa" w:w="1234"/>
+            <w:tcW w:type="dxa" w:w="1080"/>
           </w:tcPr>
           <w:p>
             <w:pPr>
@@ -177,7 +199,7 @@
             </w:pPr>
             <w:r>
               <w:rPr>
-                <w:sz w:val="18"/>
+                <w:sz w:val="16"/>
               </w:rPr>
               <w:t>MLP Late Wt</w:t>
             </w:r>
@@ -185,7 +207,7 @@
         </w:tc>
         <w:tc>
           <w:tcPr>
-            <w:tcW w:type="dxa" w:w="1234"/>
+            <w:tcW w:type="dxa" w:w="1080"/>
           </w:tcPr>
           <w:p>
             <w:pPr>
@@ -193,7 +215,7 @@
             </w:pPr>
             <w:r>
               <w:rPr>
-                <w:sz w:val="18"/>
+                <w:sz w:val="16"/>
               </w:rPr>
               <w:t>91.2 +/- 1.5</w:t>
             </w:r>
@@ -201,7 +223,7 @@
         </w:tc>
         <w:tc>
           <w:tcPr>
-            <w:tcW w:type="dxa" w:w="1234"/>
+            <w:tcW w:type="dxa" w:w="1080"/>
           </w:tcPr>
           <w:p>
             <w:pPr>
@@ -209,7 +231,7 @@
             </w:pPr>
             <w:r>
               <w:rPr>
-                <w:sz w:val="18"/>
+                <w:sz w:val="16"/>
               </w:rPr>
               <w:t>89.2 +/- 0.5</w:t>
             </w:r>
@@ -217,7 +239,7 @@
         </w:tc>
         <w:tc>
           <w:tcPr>
-            <w:tcW w:type="dxa" w:w="1234"/>
+            <w:tcW w:type="dxa" w:w="1080"/>
           </w:tcPr>
           <w:p>
             <w:pPr>
@@ -225,7 +247,7 @@
             </w:pPr>
             <w:r>
               <w:rPr>
-                <w:sz w:val="18"/>
+                <w:sz w:val="16"/>
               </w:rPr>
               <w:t>85.8 +/- 1.4</w:t>
             </w:r>
@@ -233,7 +255,7 @@
         </w:tc>
         <w:tc>
           <w:tcPr>
-            <w:tcW w:type="dxa" w:w="1234"/>
+            <w:tcW w:type="dxa" w:w="1080"/>
           </w:tcPr>
           <w:p>
             <w:pPr>
@@ -241,7 +263,7 @@
             </w:pPr>
             <w:r>
               <w:rPr>
-                <w:sz w:val="18"/>
+                <w:sz w:val="16"/>
               </w:rPr>
               <w:t>92.7 +/- 2.2</w:t>
             </w:r>
@@ -249,7 +271,7 @@
         </w:tc>
         <w:tc>
           <w:tcPr>
-            <w:tcW w:type="dxa" w:w="1234"/>
+            <w:tcW w:type="dxa" w:w="1080"/>
           </w:tcPr>
           <w:p>
             <w:pPr>
@@ -257,7 +279,7 @@
             </w:pPr>
             <w:r>
               <w:rPr>
-                <w:sz w:val="18"/>
+                <w:sz w:val="16"/>
               </w:rPr>
               <w:t>0.950 +/- 0.003</w:t>
             </w:r>
@@ -265,7 +287,7 @@
         </w:tc>
         <w:tc>
           <w:tcPr>
-            <w:tcW w:type="dxa" w:w="1234"/>
+            <w:tcW w:type="dxa" w:w="1080"/>
           </w:tcPr>
           <w:p>
             <w:pPr>
@@ -273,7 +295,23 @@
             </w:pPr>
             <w:r>
               <w:rPr>
-                <w:sz w:val="18"/>
+                <w:sz w:val="16"/>
+              </w:rPr>
+              <w:t>0.955</w:t>
+            </w:r>
+          </w:p>
+        </w:tc>
+        <w:tc>
+          <w:tcPr>
+            <w:tcW w:type="dxa" w:w="1080"/>
+          </w:tcPr>
+          <w:p>
+            <w:pPr>
+              <w:jc w:val="center"/>
+            </w:pPr>
+            <w:r>
+              <w:rPr>
+                <w:sz w:val="16"/>
               </w:rPr>
               <w:t>5</w:t>
             </w:r>
@@ -283,7 +321,7 @@
       <w:tr>
         <w:tc>
           <w:tcPr>
-            <w:tcW w:type="dxa" w:w="1234"/>
+            <w:tcW w:type="dxa" w:w="1080"/>
           </w:tcPr>
           <w:p>
             <w:pPr>
@@ -291,7 +329,7 @@
             </w:pPr>
             <w:r>
               <w:rPr>
-                <w:sz w:val="18"/>
+                <w:sz w:val="16"/>
               </w:rPr>
               <w:t>XGB Late Wt</w:t>
             </w:r>
@@ -299,7 +337,7 @@
         </w:tc>
         <w:tc>
           <w:tcPr>
-            <w:tcW w:type="dxa" w:w="1234"/>
+            <w:tcW w:type="dxa" w:w="1080"/>
           </w:tcPr>
           <w:p>
             <w:pPr>
@@ -307,7 +345,7 @@
             </w:pPr>
             <w:r>
               <w:rPr>
-                <w:sz w:val="18"/>
+                <w:sz w:val="16"/>
               </w:rPr>
               <w:t>92.0 +/- 0.8</w:t>
             </w:r>
@@ -315,7 +353,7 @@
         </w:tc>
         <w:tc>
           <w:tcPr>
-            <w:tcW w:type="dxa" w:w="1234"/>
+            <w:tcW w:type="dxa" w:w="1080"/>
           </w:tcPr>
           <w:p>
             <w:pPr>
@@ -323,7 +361,7 @@
             </w:pPr>
             <w:r>
               <w:rPr>
-                <w:sz w:val="18"/>
+                <w:sz w:val="16"/>
               </w:rPr>
               <w:t>88.6 +/- 0.7</w:t>
             </w:r>
@@ -331,7 +369,7 @@
         </w:tc>
         <w:tc>
           <w:tcPr>
-            <w:tcW w:type="dxa" w:w="1234"/>
+            <w:tcW w:type="dxa" w:w="1080"/>
           </w:tcPr>
           <w:p>
             <w:pPr>
@@ -339,7 +377,7 @@
             </w:pPr>
             <w:r>
               <w:rPr>
-                <w:sz w:val="18"/>
+                <w:sz w:val="16"/>
               </w:rPr>
               <w:t>82.6 +/- 1.4</w:t>
             </w:r>
@@ -347,7 +385,7 @@
         </w:tc>
         <w:tc>
           <w:tcPr>
-            <w:tcW w:type="dxa" w:w="1234"/>
+            <w:tcW w:type="dxa" w:w="1080"/>
           </w:tcPr>
           <w:p>
             <w:pPr>
@@ -355,7 +393,7 @@
             </w:pPr>
             <w:r>
               <w:rPr>
-                <w:sz w:val="18"/>
+                <w:sz w:val="16"/>
               </w:rPr>
               <w:t>94.6 +/- 1.1</w:t>
             </w:r>
@@ -363,7 +401,7 @@
         </w:tc>
         <w:tc>
           <w:tcPr>
-            <w:tcW w:type="dxa" w:w="1234"/>
+            <w:tcW w:type="dxa" w:w="1080"/>
           </w:tcPr>
           <w:p>
             <w:pPr>
@@ -371,7 +409,7 @@
             </w:pPr>
             <w:r>
               <w:rPr>
-                <w:sz w:val="18"/>
+                <w:sz w:val="16"/>
               </w:rPr>
               <w:t>0.949 +/- 0.002</w:t>
             </w:r>
@@ -379,7 +417,7 @@
         </w:tc>
         <w:tc>
           <w:tcPr>
-            <w:tcW w:type="dxa" w:w="1234"/>
+            <w:tcW w:type="dxa" w:w="1080"/>
           </w:tcPr>
           <w:p>
             <w:pPr>
@@ -387,7 +425,23 @@
             </w:pPr>
             <w:r>
               <w:rPr>
-                <w:sz w:val="18"/>
+                <w:sz w:val="16"/>
+              </w:rPr>
+              <w:t>0.952</w:t>
+            </w:r>
+          </w:p>
+        </w:tc>
+        <w:tc>
+          <w:tcPr>
+            <w:tcW w:type="dxa" w:w="1080"/>
+          </w:tcPr>
+          <w:p>
+            <w:pPr>
+              <w:jc w:val="center"/>
+            </w:pPr>
+            <w:r>
+              <w:rPr>
+                <w:sz w:val="16"/>
               </w:rPr>
               <w:t>5</w:t>
             </w:r>
@@ -397,7 +451,7 @@
       <w:tr>
         <w:tc>
           <w:tcPr>
-            <w:tcW w:type="dxa" w:w="1234"/>
+            <w:tcW w:type="dxa" w:w="1080"/>
           </w:tcPr>
           <w:p>
             <w:pPr>
@@ -405,7 +459,7 @@
             </w:pPr>
             <w:r>
               <w:rPr>
-                <w:sz w:val="18"/>
+                <w:sz w:val="16"/>
               </w:rPr>
               <w:t>XGB Late Stack</w:t>
             </w:r>
@@ -413,7 +467,7 @@
         </w:tc>
         <w:tc>
           <w:tcPr>
-            <w:tcW w:type="dxa" w:w="1234"/>
+            <w:tcW w:type="dxa" w:w="1080"/>
           </w:tcPr>
           <w:p>
             <w:pPr>
@@ -421,7 +475,7 @@
             </w:pPr>
             <w:r>
               <w:rPr>
-                <w:sz w:val="18"/>
+                <w:sz w:val="16"/>
               </w:rPr>
               <w:t>91.0 +/- 0.3</w:t>
             </w:r>
@@ -429,7 +483,7 @@
         </w:tc>
         <w:tc>
           <w:tcPr>
-            <w:tcW w:type="dxa" w:w="1234"/>
+            <w:tcW w:type="dxa" w:w="1080"/>
           </w:tcPr>
           <w:p>
             <w:pPr>
@@ -437,7 +491,7 @@
             </w:pPr>
             <w:r>
               <w:rPr>
-                <w:sz w:val="18"/>
+                <w:sz w:val="16"/>
               </w:rPr>
               <w:t>82.5 +/- 1.4</w:t>
             </w:r>
@@ -445,7 +499,7 @@
         </w:tc>
         <w:tc>
           <w:tcPr>
-            <w:tcW w:type="dxa" w:w="1234"/>
+            <w:tcW w:type="dxa" w:w="1080"/>
           </w:tcPr>
           <w:p>
             <w:pPr>
@@ -453,7 +507,7 @@
             </w:pPr>
             <w:r>
               <w:rPr>
-                <w:sz w:val="18"/>
+                <w:sz w:val="16"/>
               </w:rPr>
               <w:t>67.5 +/- 3.3</w:t>
             </w:r>
@@ -461,7 +515,7 @@
         </w:tc>
         <w:tc>
           <w:tcPr>
-            <w:tcW w:type="dxa" w:w="1234"/>
+            <w:tcW w:type="dxa" w:w="1080"/>
           </w:tcPr>
           <w:p>
             <w:pPr>
@@ -469,7 +523,7 @@
             </w:pPr>
             <w:r>
               <w:rPr>
-                <w:sz w:val="18"/>
+                <w:sz w:val="16"/>
               </w:rPr>
               <w:t>97.6 +/- 0.5</w:t>
             </w:r>
@@ -477,7 +531,7 @@
         </w:tc>
         <w:tc>
           <w:tcPr>
-            <w:tcW w:type="dxa" w:w="1234"/>
+            <w:tcW w:type="dxa" w:w="1080"/>
           </w:tcPr>
           <w:p>
             <w:pPr>
@@ -485,7 +539,7 @@
             </w:pPr>
             <w:r>
               <w:rPr>
-                <w:sz w:val="18"/>
+                <w:sz w:val="16"/>
               </w:rPr>
               <w:t>0.949 +/- 0.002</w:t>
             </w:r>
@@ -493,7 +547,7 @@
         </w:tc>
         <w:tc>
           <w:tcPr>
-            <w:tcW w:type="dxa" w:w="1234"/>
+            <w:tcW w:type="dxa" w:w="1080"/>
           </w:tcPr>
           <w:p>
             <w:pPr>
@@ -501,7 +555,23 @@
             </w:pPr>
             <w:r>
               <w:rPr>
-                <w:sz w:val="18"/>
+                <w:sz w:val="16"/>
+              </w:rPr>
+              <w:t>0.952</w:t>
+            </w:r>
+          </w:p>
+        </w:tc>
+        <w:tc>
+          <w:tcPr>
+            <w:tcW w:type="dxa" w:w="1080"/>
+          </w:tcPr>
+          <w:p>
+            <w:pPr>
+              <w:jc w:val="center"/>
+            </w:pPr>
+            <w:r>
+              <w:rPr>
+                <w:sz w:val="16"/>
               </w:rPr>
               <w:t>5</w:t>
             </w:r>
@@ -511,7 +581,7 @@
       <w:tr>
         <w:tc>
           <w:tcPr>
-            <w:tcW w:type="dxa" w:w="1234"/>
+            <w:tcW w:type="dxa" w:w="1080"/>
           </w:tcPr>
           <w:p>
             <w:pPr>
@@ -519,7 +589,7 @@
             </w:pPr>
             <w:r>
               <w:rPr>
-                <w:sz w:val="18"/>
+                <w:sz w:val="16"/>
               </w:rPr>
               <w:t>MLP Late Avg</w:t>
             </w:r>
@@ -527,7 +597,7 @@
         </w:tc>
         <w:tc>
           <w:tcPr>
-            <w:tcW w:type="dxa" w:w="1234"/>
+            <w:tcW w:type="dxa" w:w="1080"/>
           </w:tcPr>
           <w:p>
             <w:pPr>
@@ -535,7 +605,7 @@
             </w:pPr>
             <w:r>
               <w:rPr>
-                <w:sz w:val="18"/>
+                <w:sz w:val="16"/>
               </w:rPr>
               <w:t>89.8 +/- 1.3</w:t>
             </w:r>
@@ -543,7 +613,7 @@
         </w:tc>
         <w:tc>
           <w:tcPr>
-            <w:tcW w:type="dxa" w:w="1234"/>
+            <w:tcW w:type="dxa" w:w="1080"/>
           </w:tcPr>
           <w:p>
             <w:pPr>
@@ -551,7 +621,7 @@
             </w:pPr>
             <w:r>
               <w:rPr>
-                <w:sz w:val="18"/>
+                <w:sz w:val="16"/>
               </w:rPr>
               <w:t>86.0 +/- 1.4</w:t>
             </w:r>
@@ -559,7 +629,7 @@
         </w:tc>
         <w:tc>
           <w:tcPr>
-            <w:tcW w:type="dxa" w:w="1234"/>
+            <w:tcW w:type="dxa" w:w="1080"/>
           </w:tcPr>
           <w:p>
             <w:pPr>
@@ -567,7 +637,7 @@
             </w:pPr>
             <w:r>
               <w:rPr>
-                <w:sz w:val="18"/>
+                <w:sz w:val="16"/>
               </w:rPr>
               <w:t>79.3 +/- 4.4</w:t>
             </w:r>
@@ -575,7 +645,7 @@
         </w:tc>
         <w:tc>
           <w:tcPr>
-            <w:tcW w:type="dxa" w:w="1234"/>
+            <w:tcW w:type="dxa" w:w="1080"/>
           </w:tcPr>
           <w:p>
             <w:pPr>
@@ -583,7 +653,7 @@
             </w:pPr>
             <w:r>
               <w:rPr>
-                <w:sz w:val="18"/>
+                <w:sz w:val="16"/>
               </w:rPr>
               <w:t>92.8 +/- 2.6</w:t>
             </w:r>
@@ -591,7 +661,7 @@
         </w:tc>
         <w:tc>
           <w:tcPr>
-            <w:tcW w:type="dxa" w:w="1234"/>
+            <w:tcW w:type="dxa" w:w="1080"/>
           </w:tcPr>
           <w:p>
             <w:pPr>
@@ -599,7 +669,7 @@
             </w:pPr>
             <w:r>
               <w:rPr>
-                <w:sz w:val="18"/>
+                <w:sz w:val="16"/>
               </w:rPr>
               <w:t>0.947 +/- 0.004</w:t>
             </w:r>
@@ -607,7 +677,7 @@
         </w:tc>
         <w:tc>
           <w:tcPr>
-            <w:tcW w:type="dxa" w:w="1234"/>
+            <w:tcW w:type="dxa" w:w="1080"/>
           </w:tcPr>
           <w:p>
             <w:pPr>
@@ -615,7 +685,23 @@
             </w:pPr>
             <w:r>
               <w:rPr>
-                <w:sz w:val="18"/>
+                <w:sz w:val="16"/>
+              </w:rPr>
+              <w:t>0.953</w:t>
+            </w:r>
+          </w:p>
+        </w:tc>
+        <w:tc>
+          <w:tcPr>
+            <w:tcW w:type="dxa" w:w="1080"/>
+          </w:tcPr>
+          <w:p>
+            <w:pPr>
+              <w:jc w:val="center"/>
+            </w:pPr>
+            <w:r>
+              <w:rPr>
+                <w:sz w:val="16"/>
               </w:rPr>
               <w:t>5</w:t>
             </w:r>
@@ -625,7 +711,7 @@
       <w:tr>
         <w:tc>
           <w:tcPr>
-            <w:tcW w:type="dxa" w:w="1234"/>
+            <w:tcW w:type="dxa" w:w="1080"/>
           </w:tcPr>
           <w:p>
             <w:pPr>
@@ -633,7 +719,7 @@
             </w:pPr>
             <w:r>
               <w:rPr>
-                <w:sz w:val="18"/>
+                <w:sz w:val="16"/>
               </w:rPr>
               <w:t>XGB Late Avg</w:t>
             </w:r>
@@ -641,7 +727,7 @@
         </w:tc>
         <w:tc>
           <w:tcPr>
-            <w:tcW w:type="dxa" w:w="1234"/>
+            <w:tcW w:type="dxa" w:w="1080"/>
           </w:tcPr>
           <w:p>
             <w:pPr>
@@ -649,7 +735,7 @@
             </w:pPr>
             <w:r>
               <w:rPr>
-                <w:sz w:val="18"/>
+                <w:sz w:val="16"/>
               </w:rPr>
               <w:t>89.7 +/- 1.1</w:t>
             </w:r>
@@ -657,7 +743,7 @@
         </w:tc>
         <w:tc>
           <w:tcPr>
-            <w:tcW w:type="dxa" w:w="1234"/>
+            <w:tcW w:type="dxa" w:w="1080"/>
           </w:tcPr>
           <w:p>
             <w:pPr>
@@ -665,7 +751,7 @@
             </w:pPr>
             <w:r>
               <w:rPr>
-                <w:sz w:val="18"/>
+                <w:sz w:val="16"/>
               </w:rPr>
               <w:t>86.1 +/- 1.1</w:t>
             </w:r>
@@ -673,7 +759,7 @@
         </w:tc>
         <w:tc>
           <w:tcPr>
-            <w:tcW w:type="dxa" w:w="1234"/>
+            <w:tcW w:type="dxa" w:w="1080"/>
           </w:tcPr>
           <w:p>
             <w:pPr>
@@ -681,7 +767,7 @@
             </w:pPr>
             <w:r>
               <w:rPr>
-                <w:sz w:val="18"/>
+                <w:sz w:val="16"/>
               </w:rPr>
               <w:t>79.7 +/- 2.6</w:t>
             </w:r>
@@ -689,7 +775,7 @@
         </w:tc>
         <w:tc>
           <w:tcPr>
-            <w:tcW w:type="dxa" w:w="1234"/>
+            <w:tcW w:type="dxa" w:w="1080"/>
           </w:tcPr>
           <w:p>
             <w:pPr>
@@ -697,7 +783,7 @@
             </w:pPr>
             <w:r>
               <w:rPr>
-                <w:sz w:val="18"/>
+                <w:sz w:val="16"/>
               </w:rPr>
               <w:t>92.5 +/- 1.7</w:t>
             </w:r>
@@ -705,7 +791,7 @@
         </w:tc>
         <w:tc>
           <w:tcPr>
-            <w:tcW w:type="dxa" w:w="1234"/>
+            <w:tcW w:type="dxa" w:w="1080"/>
           </w:tcPr>
           <w:p>
             <w:pPr>
@@ -713,7 +799,7 @@
             </w:pPr>
             <w:r>
               <w:rPr>
-                <w:sz w:val="18"/>
+                <w:sz w:val="16"/>
               </w:rPr>
               <w:t>0.946 +/- 0.003</w:t>
             </w:r>
@@ -721,7 +807,7 @@
         </w:tc>
         <w:tc>
           <w:tcPr>
-            <w:tcW w:type="dxa" w:w="1234"/>
+            <w:tcW w:type="dxa" w:w="1080"/>
           </w:tcPr>
           <w:p>
             <w:pPr>
@@ -729,7 +815,23 @@
             </w:pPr>
             <w:r>
               <w:rPr>
-                <w:sz w:val="18"/>
+                <w:sz w:val="16"/>
+              </w:rPr>
+              <w:t>0.950</w:t>
+            </w:r>
+          </w:p>
+        </w:tc>
+        <w:tc>
+          <w:tcPr>
+            <w:tcW w:type="dxa" w:w="1080"/>
+          </w:tcPr>
+          <w:p>
+            <w:pPr>
+              <w:jc w:val="center"/>
+            </w:pPr>
+            <w:r>
+              <w:rPr>
+                <w:sz w:val="16"/>
               </w:rPr>
               <w:t>5</w:t>
             </w:r>
@@ -739,7 +841,7 @@
       <w:tr>
         <w:tc>
           <w:tcPr>
-            <w:tcW w:type="dxa" w:w="1234"/>
+            <w:tcW w:type="dxa" w:w="1080"/>
           </w:tcPr>
           <w:p>
             <w:pPr>
@@ -747,7 +849,7 @@
             </w:pPr>
             <w:r>
               <w:rPr>
-                <w:sz w:val="18"/>
+                <w:sz w:val="16"/>
               </w:rPr>
               <w:t>MLP Early</w:t>
             </w:r>
@@ -755,7 +857,7 @@
         </w:tc>
         <w:tc>
           <w:tcPr>
-            <w:tcW w:type="dxa" w:w="1234"/>
+            <w:tcW w:type="dxa" w:w="1080"/>
           </w:tcPr>
           <w:p>
             <w:pPr>
@@ -763,7 +865,7 @@
             </w:pPr>
             <w:r>
               <w:rPr>
-                <w:sz w:val="18"/>
+                <w:sz w:val="16"/>
               </w:rPr>
               <w:t>91.9 +/- 0.8</w:t>
             </w:r>
@@ -771,7 +873,7 @@
         </w:tc>
         <w:tc>
           <w:tcPr>
-            <w:tcW w:type="dxa" w:w="1234"/>
+            <w:tcW w:type="dxa" w:w="1080"/>
           </w:tcPr>
           <w:p>
             <w:pPr>
@@ -779,7 +881,7 @@
             </w:pPr>
             <w:r>
               <w:rPr>
-                <w:sz w:val="18"/>
+                <w:sz w:val="16"/>
               </w:rPr>
               <w:t>89.1 +/- 0.7</w:t>
             </w:r>
@@ -787,7 +889,7 @@
         </w:tc>
         <w:tc>
           <w:tcPr>
-            <w:tcW w:type="dxa" w:w="1234"/>
+            <w:tcW w:type="dxa" w:w="1080"/>
           </w:tcPr>
           <w:p>
             <w:pPr>
@@ -795,7 +897,7 @@
             </w:pPr>
             <w:r>
               <w:rPr>
-                <w:sz w:val="18"/>
+                <w:sz w:val="16"/>
               </w:rPr>
               <w:t>84.0 +/- 1.9</w:t>
             </w:r>
@@ -803,7 +905,7 @@
         </w:tc>
         <w:tc>
           <w:tcPr>
-            <w:tcW w:type="dxa" w:w="1234"/>
+            <w:tcW w:type="dxa" w:w="1080"/>
           </w:tcPr>
           <w:p>
             <w:pPr>
@@ -811,7 +913,7 @@
             </w:pPr>
             <w:r>
               <w:rPr>
-                <w:sz w:val="18"/>
+                <w:sz w:val="16"/>
               </w:rPr>
               <w:t>94.1 +/- 1.3</w:t>
             </w:r>
@@ -819,7 +921,7 @@
         </w:tc>
         <w:tc>
           <w:tcPr>
-            <w:tcW w:type="dxa" w:w="1234"/>
+            <w:tcW w:type="dxa" w:w="1080"/>
           </w:tcPr>
           <w:p>
             <w:pPr>
@@ -827,7 +929,7 @@
             </w:pPr>
             <w:r>
               <w:rPr>
-                <w:sz w:val="18"/>
+                <w:sz w:val="16"/>
               </w:rPr>
               <w:t>0.946 +/- 0.006</w:t>
             </w:r>
@@ -835,7 +937,7 @@
         </w:tc>
         <w:tc>
           <w:tcPr>
-            <w:tcW w:type="dxa" w:w="1234"/>
+            <w:tcW w:type="dxa" w:w="1080"/>
           </w:tcPr>
           <w:p>
             <w:pPr>
@@ -843,7 +945,23 @@
             </w:pPr>
             <w:r>
               <w:rPr>
-                <w:sz w:val="18"/>
+                <w:sz w:val="16"/>
+              </w:rPr>
+              <w:t>0.954</w:t>
+            </w:r>
+          </w:p>
+        </w:tc>
+        <w:tc>
+          <w:tcPr>
+            <w:tcW w:type="dxa" w:w="1080"/>
+          </w:tcPr>
+          <w:p>
+            <w:pPr>
+              <w:jc w:val="center"/>
+            </w:pPr>
+            <w:r>
+              <w:rPr>
+                <w:sz w:val="16"/>
               </w:rPr>
               <w:t>5</w:t>
             </w:r>
@@ -853,7 +971,7 @@
       <w:tr>
         <w:tc>
           <w:tcPr>
-            <w:tcW w:type="dxa" w:w="1234"/>
+            <w:tcW w:type="dxa" w:w="1080"/>
           </w:tcPr>
           <w:p>
             <w:pPr>
@@ -861,7 +979,7 @@
             </w:pPr>
             <w:r>
               <w:rPr>
-                <w:sz w:val="18"/>
+                <w:sz w:val="16"/>
               </w:rPr>
               <w:t>Tab only (XGB)</w:t>
             </w:r>
@@ -869,7 +987,7 @@
         </w:tc>
         <w:tc>
           <w:tcPr>
-            <w:tcW w:type="dxa" w:w="1234"/>
+            <w:tcW w:type="dxa" w:w="1080"/>
           </w:tcPr>
           <w:p>
             <w:pPr>
@@ -877,7 +995,7 @@
             </w:pPr>
             <w:r>
               <w:rPr>
-                <w:sz w:val="18"/>
+                <w:sz w:val="16"/>
               </w:rPr>
               <w:t>88.8 +/- 0.2</w:t>
             </w:r>
@@ -885,7 +1003,7 @@
         </w:tc>
         <w:tc>
           <w:tcPr>
-            <w:tcW w:type="dxa" w:w="1234"/>
+            <w:tcW w:type="dxa" w:w="1080"/>
           </w:tcPr>
           <w:p>
             <w:pPr>
@@ -893,7 +1011,7 @@
             </w:pPr>
             <w:r>
               <w:rPr>
-                <w:sz w:val="18"/>
+                <w:sz w:val="16"/>
               </w:rPr>
               <w:t>86.0 +/- 0.3</w:t>
             </w:r>
@@ -901,7 +1019,7 @@
         </w:tc>
         <w:tc>
           <w:tcPr>
-            <w:tcW w:type="dxa" w:w="1234"/>
+            <w:tcW w:type="dxa" w:w="1080"/>
           </w:tcPr>
           <w:p>
             <w:pPr>
@@ -909,7 +1027,7 @@
             </w:pPr>
             <w:r>
               <w:rPr>
-                <w:sz w:val="18"/>
+                <w:sz w:val="16"/>
               </w:rPr>
               <w:t>80.9 +/- 1.1</w:t>
             </w:r>
@@ -917,7 +1035,7 @@
         </w:tc>
         <w:tc>
           <w:tcPr>
-            <w:tcW w:type="dxa" w:w="1234"/>
+            <w:tcW w:type="dxa" w:w="1080"/>
           </w:tcPr>
           <w:p>
             <w:pPr>
@@ -925,7 +1043,7 @@
             </w:pPr>
             <w:r>
               <w:rPr>
-                <w:sz w:val="18"/>
+                <w:sz w:val="16"/>
               </w:rPr>
               <w:t>91.0 +/- 0.5</w:t>
             </w:r>
@@ -933,7 +1051,7 @@
         </w:tc>
         <w:tc>
           <w:tcPr>
-            <w:tcW w:type="dxa" w:w="1234"/>
+            <w:tcW w:type="dxa" w:w="1080"/>
           </w:tcPr>
           <w:p>
             <w:pPr>
@@ -941,7 +1059,7 @@
             </w:pPr>
             <w:r>
               <w:rPr>
-                <w:sz w:val="18"/>
+                <w:sz w:val="16"/>
               </w:rPr>
               <w:t>0.937 +/- 0.002</w:t>
             </w:r>
@@ -949,7 +1067,7 @@
         </w:tc>
         <w:tc>
           <w:tcPr>
-            <w:tcW w:type="dxa" w:w="1234"/>
+            <w:tcW w:type="dxa" w:w="1080"/>
           </w:tcPr>
           <w:p>
             <w:pPr>
@@ -957,7 +1075,23 @@
             </w:pPr>
             <w:r>
               <w:rPr>
-                <w:sz w:val="18"/>
+                <w:sz w:val="16"/>
+              </w:rPr>
+              <w:t>0.939</w:t>
+            </w:r>
+          </w:p>
+        </w:tc>
+        <w:tc>
+          <w:tcPr>
+            <w:tcW w:type="dxa" w:w="1080"/>
+          </w:tcPr>
+          <w:p>
+            <w:pPr>
+              <w:jc w:val="center"/>
+            </w:pPr>
+            <w:r>
+              <w:rPr>
+                <w:sz w:val="16"/>
               </w:rPr>
               <w:t>5</w:t>
             </w:r>
@@ -967,7 +1101,7 @@
       <w:tr>
         <w:tc>
           <w:tcPr>
-            <w:tcW w:type="dxa" w:w="1234"/>
+            <w:tcW w:type="dxa" w:w="1080"/>
           </w:tcPr>
           <w:p>
             <w:pPr>
@@ -975,7 +1109,7 @@
             </w:pPr>
             <w:r>
               <w:rPr>
-                <w:sz w:val="18"/>
+                <w:sz w:val="16"/>
               </w:rPr>
               <w:t>Tab only (MLP)</w:t>
             </w:r>
@@ -983,7 +1117,7 @@
         </w:tc>
         <w:tc>
           <w:tcPr>
-            <w:tcW w:type="dxa" w:w="1234"/>
+            <w:tcW w:type="dxa" w:w="1080"/>
           </w:tcPr>
           <w:p>
             <w:pPr>
@@ -991,7 +1125,7 @@
             </w:pPr>
             <w:r>
               <w:rPr>
-                <w:sz w:val="18"/>
+                <w:sz w:val="16"/>
               </w:rPr>
               <w:t>85.0 +/- 1.3</w:t>
             </w:r>
@@ -999,7 +1133,7 @@
         </w:tc>
         <w:tc>
           <w:tcPr>
-            <w:tcW w:type="dxa" w:w="1234"/>
+            <w:tcW w:type="dxa" w:w="1080"/>
           </w:tcPr>
           <w:p>
             <w:pPr>
@@ -1007,7 +1141,7 @@
             </w:pPr>
             <w:r>
               <w:rPr>
-                <w:sz w:val="18"/>
+                <w:sz w:val="16"/>
               </w:rPr>
               <w:t>85.8 +/- 0.6</w:t>
             </w:r>
@@ -1015,7 +1149,7 @@
         </w:tc>
         <w:tc>
           <w:tcPr>
-            <w:tcW w:type="dxa" w:w="1234"/>
+            <w:tcW w:type="dxa" w:w="1080"/>
           </w:tcPr>
           <w:p>
             <w:pPr>
@@ -1023,7 +1157,7 @@
             </w:pPr>
             <w:r>
               <w:rPr>
-                <w:sz w:val="18"/>
+                <w:sz w:val="16"/>
               </w:rPr>
               <w:t>87.3 +/- 1.3</w:t>
             </w:r>
@@ -1031,7 +1165,7 @@
         </w:tc>
         <w:tc>
           <w:tcPr>
-            <w:tcW w:type="dxa" w:w="1234"/>
+            <w:tcW w:type="dxa" w:w="1080"/>
           </w:tcPr>
           <w:p>
             <w:pPr>
@@ -1039,7 +1173,7 @@
             </w:pPr>
             <w:r>
               <w:rPr>
-                <w:sz w:val="18"/>
+                <w:sz w:val="16"/>
               </w:rPr>
               <w:t>84.4 +/- 1.9</w:t>
             </w:r>
@@ -1047,7 +1181,7 @@
         </w:tc>
         <w:tc>
           <w:tcPr>
-            <w:tcW w:type="dxa" w:w="1234"/>
+            <w:tcW w:type="dxa" w:w="1080"/>
           </w:tcPr>
           <w:p>
             <w:pPr>
@@ -1055,7 +1189,7 @@
             </w:pPr>
             <w:r>
               <w:rPr>
-                <w:sz w:val="18"/>
+                <w:sz w:val="16"/>
               </w:rPr>
               <w:t>0.933 +/- 0.002</w:t>
             </w:r>
@@ -1063,7 +1197,7 @@
         </w:tc>
         <w:tc>
           <w:tcPr>
-            <w:tcW w:type="dxa" w:w="1234"/>
+            <w:tcW w:type="dxa" w:w="1080"/>
           </w:tcPr>
           <w:p>
             <w:pPr>
@@ -1071,7 +1205,23 @@
             </w:pPr>
             <w:r>
               <w:rPr>
-                <w:sz w:val="18"/>
+                <w:sz w:val="16"/>
+              </w:rPr>
+              <w:t>0.935</w:t>
+            </w:r>
+          </w:p>
+        </w:tc>
+        <w:tc>
+          <w:tcPr>
+            <w:tcW w:type="dxa" w:w="1080"/>
+          </w:tcPr>
+          <w:p>
+            <w:pPr>
+              <w:jc w:val="center"/>
+            </w:pPr>
+            <w:r>
+              <w:rPr>
+                <w:sz w:val="16"/>
               </w:rPr>
               <w:t>5</w:t>
             </w:r>
@@ -1081,7 +1231,7 @@
       <w:tr>
         <w:tc>
           <w:tcPr>
-            <w:tcW w:type="dxa" w:w="1234"/>
+            <w:tcW w:type="dxa" w:w="1080"/>
           </w:tcPr>
           <w:p>
             <w:pPr>
@@ -1089,7 +1239,7 @@
             </w:pPr>
             <w:r>
               <w:rPr>
-                <w:sz w:val="18"/>
+                <w:sz w:val="16"/>
               </w:rPr>
               <w:t>XGB Early</w:t>
             </w:r>
@@ -1097,7 +1247,7 @@
         </w:tc>
         <w:tc>
           <w:tcPr>
-            <w:tcW w:type="dxa" w:w="1234"/>
+            <w:tcW w:type="dxa" w:w="1080"/>
           </w:tcPr>
           <w:p>
             <w:pPr>
@@ -1105,7 +1255,7 @@
             </w:pPr>
             <w:r>
               <w:rPr>
-                <w:sz w:val="18"/>
+                <w:sz w:val="16"/>
               </w:rPr>
               <w:t>89.6 +/- 1.3</w:t>
             </w:r>
@@ -1113,7 +1263,7 @@
         </w:tc>
         <w:tc>
           <w:tcPr>
-            <w:tcW w:type="dxa" w:w="1234"/>
+            <w:tcW w:type="dxa" w:w="1080"/>
           </w:tcPr>
           <w:p>
             <w:pPr>
@@ -1121,7 +1271,7 @@
             </w:pPr>
             <w:r>
               <w:rPr>
-                <w:sz w:val="18"/>
+                <w:sz w:val="16"/>
               </w:rPr>
               <w:t>85.3 +/- 2.3</w:t>
             </w:r>
@@ -1129,7 +1279,7 @@
         </w:tc>
         <w:tc>
           <w:tcPr>
-            <w:tcW w:type="dxa" w:w="1234"/>
+            <w:tcW w:type="dxa" w:w="1080"/>
           </w:tcPr>
           <w:p>
             <w:pPr>
@@ -1137,7 +1287,7 @@
             </w:pPr>
             <w:r>
               <w:rPr>
-                <w:sz w:val="18"/>
+                <w:sz w:val="16"/>
               </w:rPr>
               <w:t>77.7 +/- 4.1</w:t>
             </w:r>
@@ -1145,7 +1295,7 @@
         </w:tc>
         <w:tc>
           <w:tcPr>
-            <w:tcW w:type="dxa" w:w="1234"/>
+            <w:tcW w:type="dxa" w:w="1080"/>
           </w:tcPr>
           <w:p>
             <w:pPr>
@@ -1153,7 +1303,7 @@
             </w:pPr>
             <w:r>
               <w:rPr>
-                <w:sz w:val="18"/>
+                <w:sz w:val="16"/>
               </w:rPr>
               <w:t>92.9 +/- 0.6</w:t>
             </w:r>
@@ -1161,7 +1311,7 @@
         </w:tc>
         <w:tc>
           <w:tcPr>
-            <w:tcW w:type="dxa" w:w="1234"/>
+            <w:tcW w:type="dxa" w:w="1080"/>
           </w:tcPr>
           <w:p>
             <w:pPr>
@@ -1169,7 +1319,7 @@
             </w:pPr>
             <w:r>
               <w:rPr>
-                <w:sz w:val="18"/>
+                <w:sz w:val="16"/>
               </w:rPr>
               <w:t>0.931 +/- 0.018</w:t>
             </w:r>
@@ -1177,7 +1327,7 @@
         </w:tc>
         <w:tc>
           <w:tcPr>
-            <w:tcW w:type="dxa" w:w="1234"/>
+            <w:tcW w:type="dxa" w:w="1080"/>
           </w:tcPr>
           <w:p>
             <w:pPr>
@@ -1185,7 +1335,23 @@
             </w:pPr>
             <w:r>
               <w:rPr>
-                <w:sz w:val="18"/>
+                <w:sz w:val="16"/>
+              </w:rPr>
+              <w:t>0.943</w:t>
+            </w:r>
+          </w:p>
+        </w:tc>
+        <w:tc>
+          <w:tcPr>
+            <w:tcW w:type="dxa" w:w="1080"/>
+          </w:tcPr>
+          <w:p>
+            <w:pPr>
+              <w:jc w:val="center"/>
+            </w:pPr>
+            <w:r>
+              <w:rPr>
+                <w:sz w:val="16"/>
               </w:rPr>
               <w:t>5</w:t>
             </w:r>
@@ -1195,7 +1361,7 @@
       <w:tr>
         <w:tc>
           <w:tcPr>
-            <w:tcW w:type="dxa" w:w="1234"/>
+            <w:tcW w:type="dxa" w:w="1080"/>
           </w:tcPr>
           <w:p>
             <w:pPr>
@@ -1203,7 +1369,7 @@
             </w:pPr>
             <w:r>
               <w:rPr>
-                <w:sz w:val="18"/>
+                <w:sz w:val="16"/>
               </w:rPr>
               <w:t>MLP Late Stack</w:t>
             </w:r>
@@ -1211,7 +1377,7 @@
         </w:tc>
         <w:tc>
           <w:tcPr>
-            <w:tcW w:type="dxa" w:w="1234"/>
+            <w:tcW w:type="dxa" w:w="1080"/>
           </w:tcPr>
           <w:p>
             <w:pPr>
@@ -1219,7 +1385,7 @@
             </w:pPr>
             <w:r>
               <w:rPr>
-                <w:sz w:val="18"/>
+                <w:sz w:val="16"/>
               </w:rPr>
               <w:t>88.4 +/- 1.1</w:t>
             </w:r>
@@ -1227,7 +1393,7 @@
         </w:tc>
         <w:tc>
           <w:tcPr>
-            <w:tcW w:type="dxa" w:w="1234"/>
+            <w:tcW w:type="dxa" w:w="1080"/>
           </w:tcPr>
           <w:p>
             <w:pPr>
@@ -1235,7 +1401,7 @@
             </w:pPr>
             <w:r>
               <w:rPr>
-                <w:sz w:val="18"/>
+                <w:sz w:val="16"/>
               </w:rPr>
               <w:t>81.6 +/- 1.1</w:t>
             </w:r>
@@ -1243,7 +1409,7 @@
         </w:tc>
         <w:tc>
           <w:tcPr>
-            <w:tcW w:type="dxa" w:w="1234"/>
+            <w:tcW w:type="dxa" w:w="1080"/>
           </w:tcPr>
           <w:p>
             <w:pPr>
@@ -1251,7 +1417,7 @@
             </w:pPr>
             <w:r>
               <w:rPr>
-                <w:sz w:val="18"/>
+                <w:sz w:val="16"/>
               </w:rPr>
               <w:t>69.6 +/- 4.0</w:t>
             </w:r>
@@ -1259,7 +1425,7 @@
         </w:tc>
         <w:tc>
           <w:tcPr>
-            <w:tcW w:type="dxa" w:w="1234"/>
+            <w:tcW w:type="dxa" w:w="1080"/>
           </w:tcPr>
           <w:p>
             <w:pPr>
@@ -1267,7 +1433,7 @@
             </w:pPr>
             <w:r>
               <w:rPr>
-                <w:sz w:val="18"/>
+                <w:sz w:val="16"/>
               </w:rPr>
               <w:t>93.6 +/- 2.3</w:t>
             </w:r>
@@ -1275,7 +1441,7 @@
         </w:tc>
         <w:tc>
           <w:tcPr>
-            <w:tcW w:type="dxa" w:w="1234"/>
+            <w:tcW w:type="dxa" w:w="1080"/>
           </w:tcPr>
           <w:p>
             <w:pPr>
@@ -1283,7 +1449,7 @@
             </w:pPr>
             <w:r>
               <w:rPr>
-                <w:sz w:val="18"/>
+                <w:sz w:val="16"/>
               </w:rPr>
               <w:t>0.910 +/- 0.030</w:t>
             </w:r>
@@ -1291,7 +1457,7 @@
         </w:tc>
         <w:tc>
           <w:tcPr>
-            <w:tcW w:type="dxa" w:w="1234"/>
+            <w:tcW w:type="dxa" w:w="1080"/>
           </w:tcPr>
           <w:p>
             <w:pPr>
@@ -1299,7 +1465,23 @@
             </w:pPr>
             <w:r>
               <w:rPr>
-                <w:sz w:val="18"/>
+                <w:sz w:val="16"/>
+              </w:rPr>
+              <w:t>0.926</w:t>
+            </w:r>
+          </w:p>
+        </w:tc>
+        <w:tc>
+          <w:tcPr>
+            <w:tcW w:type="dxa" w:w="1080"/>
+          </w:tcPr>
+          <w:p>
+            <w:pPr>
+              <w:jc w:val="center"/>
+            </w:pPr>
+            <w:r>
+              <w:rPr>
+                <w:sz w:val="16"/>
               </w:rPr>
               <w:t>5</w:t>
             </w:r>
@@ -1309,7 +1491,7 @@
       <w:tr>
         <w:tc>
           <w:tcPr>
-            <w:tcW w:type="dxa" w:w="1234"/>
+            <w:tcW w:type="dxa" w:w="1080"/>
           </w:tcPr>
           <w:p>
             <w:pPr>
@@ -1317,7 +1499,7 @@
             </w:pPr>
             <w:r>
               <w:rPr>
-                <w:sz w:val="18"/>
+                <w:sz w:val="16"/>
               </w:rPr>
               <w:t>MRI only</w:t>
             </w:r>
@@ -1325,7 +1507,7 @@
         </w:tc>
         <w:tc>
           <w:tcPr>
-            <w:tcW w:type="dxa" w:w="1234"/>
+            <w:tcW w:type="dxa" w:w="1080"/>
           </w:tcPr>
           <w:p>
             <w:pPr>
@@ -1333,7 +1515,7 @@
             </w:pPr>
             <w:r>
               <w:rPr>
-                <w:sz w:val="18"/>
+                <w:sz w:val="16"/>
               </w:rPr>
               <w:t>86.7 +/- 0.7</w:t>
             </w:r>
@@ -1341,7 +1523,7 @@
         </w:tc>
         <w:tc>
           <w:tcPr>
-            <w:tcW w:type="dxa" w:w="1234"/>
+            <w:tcW w:type="dxa" w:w="1080"/>
           </w:tcPr>
           <w:p>
             <w:pPr>
@@ -1349,7 +1531,7 @@
             </w:pPr>
             <w:r>
               <w:rPr>
-                <w:sz w:val="18"/>
+                <w:sz w:val="16"/>
               </w:rPr>
               <w:t>82.7 +/- 0.6</w:t>
             </w:r>
@@ -1357,7 +1539,7 @@
         </w:tc>
         <w:tc>
           <w:tcPr>
-            <w:tcW w:type="dxa" w:w="1234"/>
+            <w:tcW w:type="dxa" w:w="1080"/>
           </w:tcPr>
           <w:p>
             <w:pPr>
@@ -1365,7 +1547,7 @@
             </w:pPr>
             <w:r>
               <w:rPr>
-                <w:sz w:val="18"/>
+                <w:sz w:val="16"/>
               </w:rPr>
               <w:t>75.6 +/- 2.8</w:t>
             </w:r>
@@ -1373,7 +1555,7 @@
         </w:tc>
         <w:tc>
           <w:tcPr>
-            <w:tcW w:type="dxa" w:w="1234"/>
+            <w:tcW w:type="dxa" w:w="1080"/>
           </w:tcPr>
           <w:p>
             <w:pPr>
@@ -1381,7 +1563,7 @@
             </w:pPr>
             <w:r>
               <w:rPr>
-                <w:sz w:val="18"/>
+                <w:sz w:val="16"/>
               </w:rPr>
               <w:t>89.8 +/- 1.7</w:t>
             </w:r>
@@ -1389,7 +1571,7 @@
         </w:tc>
         <w:tc>
           <w:tcPr>
-            <w:tcW w:type="dxa" w:w="1234"/>
+            <w:tcW w:type="dxa" w:w="1080"/>
           </w:tcPr>
           <w:p>
             <w:pPr>
@@ -1397,7 +1579,7 @@
             </w:pPr>
             <w:r>
               <w:rPr>
-                <w:sz w:val="18"/>
+                <w:sz w:val="16"/>
               </w:rPr>
               <w:t>0.901 +/- 0.010</w:t>
             </w:r>
@@ -1405,7 +1587,7 @@
         </w:tc>
         <w:tc>
           <w:tcPr>
-            <w:tcW w:type="dxa" w:w="1234"/>
+            <w:tcW w:type="dxa" w:w="1080"/>
           </w:tcPr>
           <w:p>
             <w:pPr>
@@ -1413,7 +1595,23 @@
             </w:pPr>
             <w:r>
               <w:rPr>
-                <w:sz w:val="18"/>
+                <w:sz w:val="16"/>
+              </w:rPr>
+              <w:t>0.914</w:t>
+            </w:r>
+          </w:p>
+        </w:tc>
+        <w:tc>
+          <w:tcPr>
+            <w:tcW w:type="dxa" w:w="1080"/>
+          </w:tcPr>
+          <w:p>
+            <w:pPr>
+              <w:jc w:val="center"/>
+            </w:pPr>
+            <w:r>
+              <w:rPr>
+                <w:sz w:val="16"/>
               </w:rPr>
               <w:t>5</w:t>
             </w:r>
@@ -1421,6 +1619,15 @@
         </w:tc>
       </w:tr>
     </w:tbl>
+    <w:p>
+      <w:r>
+        <w:t>Le tableau présente deux colonnes d'AUC :</w:t>
+        <w:br/>
+        <w:t>- AUC (moy. seeds) : moyenne des AUC calculées indépendamment pour chaque seed. Mesure la performance typique et la stabilité du modèle.</w:t>
+        <w:br/>
+        <w:t>- AUC (ensemble) : AUC calculée sur les probabilités moyennées sur les 5 seeds. Bénéficie d'un effet d'ensemble qui réduit le bruit de prédiction. C'est cette valeur qui est utilisée pour le test de DeLong et les matrices de confusion.</w:t>
+      </w:r>
+    </w:p>
     <w:p/>
     <w:p>
       <w:pPr>
@@ -1577,7 +1784,47 @@
     </w:p>
     <w:p>
       <w:r>
-        <w:t>Les matrices de confusion ci-dessous sont calculées à partir des probabilités moyennes sur les 5 seeds (seuil de décision = 0.5). Le jeu de test contient 712 patients CN et 198 patients AD.</w:t>
+        <w:t>Les matrices de confusion ci-dessous sont calculées selon la procédure suivante :</w:t>
+      </w:r>
+    </w:p>
+    <w:p>
+      <w:pPr>
+        <w:pStyle w:val="ListNumber"/>
+      </w:pPr>
+      <w:r>
+        <w:t>Pour chaque méthode, on dispose des probabilités de prédiction p(AD) issues de 5 seeds indépendantes (5 entraînements avec des initialisations aléatoires différentes).</w:t>
+      </w:r>
+    </w:p>
+    <w:p>
+      <w:pPr>
+        <w:pStyle w:val="ListNumber"/>
+      </w:pPr>
+      <w:r>
+        <w:t>On calcule la probabilité moyenne sur les 5 seeds pour chaque patient : p_ensemble(AD) = (p_seed0 + p_seed1 + ... + p_seed4) / 5.</w:t>
+      </w:r>
+    </w:p>
+    <w:p>
+      <w:pPr>
+        <w:pStyle w:val="ListNumber"/>
+      </w:pPr>
+      <w:r>
+        <w:t>On applique un seuil de décision de 0.5 : si p_ensemble(AD) &gt;= 0.5, le patient est prédit AD, sinon CN.</w:t>
+      </w:r>
+    </w:p>
+    <w:p>
+      <w:pPr>
+        <w:pStyle w:val="ListNumber"/>
+      </w:pPr>
+      <w:r>
+        <w:t>La matrice de confusion est construite à partir de ces prédictions ensemblistes comparées aux vraies étiquettes du jeu de test (712 CN, 198 AD).</w:t>
+      </w:r>
+    </w:p>
+    <w:p>
+      <w:pPr>
+        <w:pStyle w:val="ListNumber"/>
+      </w:pPr>
+      <w:r>
+        <w:t>L'AUC affichée est calculée directement sur les probabilités moyennées (colonne "AUC ensemble" du tableau section 1).</w:t>
       </w:r>
     </w:p>
     <w:p>
@@ -1617,11 +1864,6 @@
             </a:graphic>
           </wp:inline>
         </w:drawing>
-      </w:r>
-    </w:p>
-    <w:p>
-      <w:r>
-        <w:t>Note : les AUC affichées sur les matrices de confusion correspondent aux AUC calculées sur les probabilités moyennées (utilisées pour le test de DeLong). Elles diffèrent légèrement des AUC du tableau de performances (section 1), qui sont la moyenne des AUC individuelles par seed. Les deux métriques sont complémentaires : la moyenne par seed mesure la stabilité, tandis que l'AUC sur probabilités moyennées bénéficie de l'effet d'ensemble.</w:t>
       </w:r>
     </w:p>
     <w:p>

</xml_diff>